<commit_message>
start of the Req. doc.
</commit_message>
<xml_diff>
--- a/srDesign_Requirements.docx
+++ b/srDesign_Requirements.docx
@@ -116,18 +116,8 @@
           <w:b w:val="0"/>
           <w:bCs w:val="0"/>
         </w:rPr>
-        <w:t xml:space="preserve">David </w:t>
+        <w:t>David Jarman</w:t>
       </w:r>
-      <w:proofErr w:type="spellStart"/>
-      <w:r>
-        <w:rPr>
-          <w:rStyle w:val="IntenseEmphasis"/>
-          <w:b w:val="0"/>
-          <w:bCs w:val="0"/>
-        </w:rPr>
-        <w:t>Jarman</w:t>
-      </w:r>
-      <w:proofErr w:type="spellEnd"/>
     </w:p>
     <w:p>
       <w:pPr>
@@ -145,18 +135,8 @@
           <w:b w:val="0"/>
           <w:bCs w:val="0"/>
         </w:rPr>
-        <w:t xml:space="preserve">Kevin </w:t>
+        <w:t>Kevin Worner</w:t>
       </w:r>
-      <w:proofErr w:type="spellStart"/>
-      <w:r>
-        <w:rPr>
-          <w:rStyle w:val="IntenseEmphasis"/>
-          <w:b w:val="0"/>
-          <w:bCs w:val="0"/>
-        </w:rPr>
-        <w:t>Worner</w:t>
-      </w:r>
-      <w:proofErr w:type="spellEnd"/>
     </w:p>
     <w:p>
       <w:pPr>
@@ -719,8 +699,6 @@
           <w:r>
             <w:t>Table of Contents</w:t>
           </w:r>
-          <w:bookmarkStart w:id="0" w:name="_GoBack"/>
-          <w:bookmarkEnd w:id="0"/>
         </w:p>
         <w:p>
           <w:pPr>
@@ -2593,12 +2571,12 @@
           <w:numId w:val="10"/>
         </w:numPr>
       </w:pPr>
-      <w:bookmarkStart w:id="1" w:name="_Toc335908947"/>
+      <w:bookmarkStart w:id="0" w:name="_Toc335908947"/>
       <w:r>
         <w:lastRenderedPageBreak/>
         <w:t>Requirements</w:t>
       </w:r>
-      <w:bookmarkEnd w:id="1"/>
+      <w:bookmarkEnd w:id="0"/>
     </w:p>
     <w:p>
       <w:pPr>
@@ -2608,11 +2586,11 @@
           <w:numId w:val="10"/>
         </w:numPr>
       </w:pPr>
-      <w:bookmarkStart w:id="2" w:name="_Toc335908948"/>
+      <w:bookmarkStart w:id="1" w:name="_Toc335908948"/>
       <w:r>
         <w:t>Scope</w:t>
       </w:r>
-      <w:bookmarkEnd w:id="2"/>
+      <w:bookmarkEnd w:id="1"/>
     </w:p>
     <w:p>
       <w:pPr>
@@ -2622,11 +2600,11 @@
           <w:numId w:val="10"/>
         </w:numPr>
       </w:pPr>
-      <w:bookmarkStart w:id="3" w:name="_Toc335908949"/>
+      <w:bookmarkStart w:id="2" w:name="_Toc335908949"/>
       <w:r>
         <w:t>Purpose of the System</w:t>
       </w:r>
-      <w:bookmarkEnd w:id="3"/>
+      <w:bookmarkEnd w:id="2"/>
     </w:p>
     <w:p>
       <w:pPr>
@@ -2636,11 +2614,11 @@
           <w:numId w:val="10"/>
         </w:numPr>
       </w:pPr>
-      <w:bookmarkStart w:id="4" w:name="_Toc335908950"/>
+      <w:bookmarkStart w:id="3" w:name="_Toc335908950"/>
       <w:r>
         <w:t>Stakeholder Information</w:t>
       </w:r>
-      <w:bookmarkEnd w:id="4"/>
+      <w:bookmarkEnd w:id="3"/>
     </w:p>
     <w:p>
       <w:pPr>
@@ -2650,11 +2628,19 @@
           <w:numId w:val="10"/>
         </w:numPr>
       </w:pPr>
-      <w:bookmarkStart w:id="5" w:name="_Toc335908951"/>
+      <w:bookmarkStart w:id="4" w:name="_Toc335908951"/>
       <w:r>
         <w:t>Customer or End User (Product Owner)</w:t>
       </w:r>
-      <w:bookmarkEnd w:id="5"/>
+      <w:bookmarkEnd w:id="4"/>
+    </w:p>
+    <w:p>
+      <w:pPr>
+        <w:ind w:left="720"/>
+      </w:pPr>
+      <w:r>
+        <w:t>Innovative Systems LLC</w:t>
+      </w:r>
     </w:p>
     <w:p>
       <w:pPr>
@@ -2664,11 +2650,19 @@
           <w:numId w:val="10"/>
         </w:numPr>
       </w:pPr>
-      <w:bookmarkStart w:id="6" w:name="_Toc335908952"/>
+      <w:bookmarkStart w:id="5" w:name="_Toc335908952"/>
       <w:r>
         <w:t>Management or Instructor (Scrum Master)</w:t>
       </w:r>
-      <w:bookmarkEnd w:id="6"/>
+      <w:bookmarkEnd w:id="5"/>
+    </w:p>
+    <w:p>
+      <w:pPr>
+        <w:ind w:left="720"/>
+      </w:pPr>
+      <w:r>
+        <w:t>Brian Butterfield</w:t>
+      </w:r>
     </w:p>
     <w:p>
       <w:pPr>
@@ -2678,11 +2672,11 @@
           <w:numId w:val="10"/>
         </w:numPr>
       </w:pPr>
-      <w:bookmarkStart w:id="7" w:name="_Toc335908953"/>
+      <w:bookmarkStart w:id="6" w:name="_Toc335908953"/>
       <w:r>
         <w:t>Investors</w:t>
       </w:r>
-      <w:bookmarkEnd w:id="7"/>
+      <w:bookmarkEnd w:id="6"/>
     </w:p>
     <w:p>
       <w:pPr>
@@ -2692,11 +2686,19 @@
           <w:numId w:val="10"/>
         </w:numPr>
       </w:pPr>
-      <w:bookmarkStart w:id="8" w:name="_Toc335908954"/>
+      <w:bookmarkStart w:id="7" w:name="_Toc335908954"/>
       <w:r>
         <w:t>Developers, Testers</w:t>
       </w:r>
-      <w:bookmarkEnd w:id="8"/>
+      <w:bookmarkEnd w:id="7"/>
+    </w:p>
+    <w:p>
+      <w:pPr>
+        <w:ind w:left="720"/>
+      </w:pPr>
+      <w:r>
+        <w:t xml:space="preserve">Marshall Gaucher, David Jarman, Kevin Worner. </w:t>
+      </w:r>
     </w:p>
     <w:p>
       <w:pPr>
@@ -2706,11 +2708,11 @@
           <w:numId w:val="10"/>
         </w:numPr>
       </w:pPr>
-      <w:bookmarkStart w:id="9" w:name="_Toc335908955"/>
+      <w:bookmarkStart w:id="8" w:name="_Toc335908955"/>
       <w:r>
         <w:t>Business Need</w:t>
       </w:r>
-      <w:bookmarkEnd w:id="9"/>
+      <w:bookmarkEnd w:id="8"/>
     </w:p>
     <w:p>
       <w:pPr>
@@ -2720,11 +2722,11 @@
           <w:numId w:val="10"/>
         </w:numPr>
       </w:pPr>
-      <w:bookmarkStart w:id="10" w:name="_Toc335908956"/>
+      <w:bookmarkStart w:id="9" w:name="_Toc335908956"/>
       <w:r>
         <w:t>Requirements and Design Constraints</w:t>
       </w:r>
-      <w:bookmarkEnd w:id="10"/>
+      <w:bookmarkEnd w:id="9"/>
     </w:p>
     <w:p>
       <w:pPr>
@@ -2734,11 +2736,11 @@
           <w:numId w:val="10"/>
         </w:numPr>
       </w:pPr>
-      <w:bookmarkStart w:id="11" w:name="_Toc335908957"/>
+      <w:bookmarkStart w:id="10" w:name="_Toc335908957"/>
       <w:r>
         <w:t>System Requirements</w:t>
       </w:r>
-      <w:bookmarkEnd w:id="11"/>
+      <w:bookmarkEnd w:id="10"/>
     </w:p>
     <w:p>
       <w:pPr>
@@ -2748,11 +2750,25 @@
           <w:numId w:val="10"/>
         </w:numPr>
       </w:pPr>
-      <w:bookmarkStart w:id="12" w:name="_Toc335908958"/>
+      <w:bookmarkStart w:id="11" w:name="_Toc335908958"/>
       <w:r>
         <w:t>Network Requirements</w:t>
       </w:r>
-      <w:bookmarkEnd w:id="12"/>
+      <w:bookmarkEnd w:id="11"/>
+    </w:p>
+    <w:p>
+      <w:pPr>
+        <w:ind w:left="720"/>
+      </w:pPr>
+      <w:r>
+        <w:t xml:space="preserve">The project needs to be able to </w:t>
+      </w:r>
+      <w:r>
+        <w:t xml:space="preserve">handle from 100’s to 1000’s of </w:t>
+      </w:r>
+      <w:r>
+        <w:t>concurrent users connecting to the server using TCP(probably).</w:t>
+      </w:r>
     </w:p>
     <w:p>
       <w:pPr>
@@ -2762,11 +2778,20 @@
           <w:numId w:val="10"/>
         </w:numPr>
       </w:pPr>
-      <w:bookmarkStart w:id="13" w:name="_Toc335908959"/>
+      <w:bookmarkStart w:id="12" w:name="_Toc335908959"/>
       <w:r>
         <w:t>Development Environment Requirements</w:t>
       </w:r>
-      <w:bookmarkEnd w:id="13"/>
+      <w:bookmarkStart w:id="13" w:name="_Toc335908960"/>
+      <w:bookmarkEnd w:id="12"/>
+    </w:p>
+    <w:p>
+      <w:pPr>
+        <w:ind w:left="720"/>
+      </w:pPr>
+      <w:r>
+        <w:t>We will be using Windows and Visual Studio 2012 to create the server, and QT to create the generic games page for the STB. QT will need to be run in a linux environment, of which we already have a image.</w:t>
+      </w:r>
     </w:p>
     <w:p>
       <w:pPr>
@@ -2776,10 +2801,50 @@
           <w:numId w:val="10"/>
         </w:numPr>
       </w:pPr>
-      <w:bookmarkStart w:id="14" w:name="_Toc335908960"/>
       <w:r>
-        <w:t>Project Management Methodology</w:t>
+        <w:t>Project Management Methodolog</w:t>
       </w:r>
+      <w:bookmarkEnd w:id="13"/>
+      <w:r>
+        <w:t>y</w:t>
+      </w:r>
+    </w:p>
+    <w:p>
+      <w:pPr>
+        <w:ind w:left="720"/>
+      </w:pPr>
+      <w:r>
+        <w:t>We are using Trello (</w:t>
+      </w:r>
+      <w:hyperlink r:id="rId8" w:history="1">
+        <w:r>
+          <w:rPr>
+            <w:rStyle w:val="Hyperlink"/>
+          </w:rPr>
+          <w:t>https://trello.com/board/stbmf/504e02192177bda83e2fab82</w:t>
+        </w:r>
+      </w:hyperlink>
+      <w:r>
+        <w:t xml:space="preserve">) to keep track of, prioritize, and groom our backlog and sprints. Everyone on the team has access to Trello and is able to edit the tasks. </w:t>
+      </w:r>
+    </w:p>
+    <w:p>
+      <w:pPr>
+        <w:ind w:left="720"/>
+      </w:pPr>
+      <w:r>
+        <w:t>We will have 3 sprints in the fall, and 3 sprints in the spring for this project. Sprint lengths will be varying, with an average length of 3.5 weeks.</w:t>
+      </w:r>
+    </w:p>
+    <w:p>
+      <w:pPr>
+        <w:ind w:left="720"/>
+      </w:pPr>
+      <w:r>
+        <w:lastRenderedPageBreak/>
+        <w:t>Our code will be hosted and controlled by Innovative Systems LLC, with only team members and employees having access. Our documents will be hosted on Github.com, in a public repository. Only team members have push access to the documents however, so there is no worry of a stranger editing our docs.</w:t>
+      </w:r>
+      <w:bookmarkStart w:id="14" w:name="_GoBack"/>
       <w:bookmarkEnd w:id="14"/>
     </w:p>
     <w:p>
@@ -2890,7 +2955,6 @@
       </w:pPr>
       <w:bookmarkStart w:id="22" w:name="_Toc335908968"/>
       <w:r>
-        <w:lastRenderedPageBreak/>
         <w:t>Research or Proof of Concept Results</w:t>
       </w:r>
       <w:bookmarkEnd w:id="22"/>
@@ -5266,7 +5330,7 @@
 </file>
 
 <file path=customXml/itemProps1.xml><?xml version="1.0" encoding="utf-8"?>
-<ds:datastoreItem xmlns:ds="http://schemas.openxmlformats.org/officeDocument/2006/customXml" ds:itemID="{ED4FFA9B-E099-475D-9F74-CEB95D8B8F37}">
+<ds:datastoreItem xmlns:ds="http://schemas.openxmlformats.org/officeDocument/2006/customXml" ds:itemID="{0D9D5B5C-E897-4F9A-BCE6-854AE4B533CF}">
   <ds:schemaRefs>
     <ds:schemaRef ds:uri="http://schemas.openxmlformats.org/officeDocument/2006/bibliography"/>
   </ds:schemaRefs>

</xml_diff>